<commit_message>
Restore paper citations for BGE, Sentence-BERT, ILS and adaptive RAG
Co-Authored-By: Claude Opus 5.5 <noreply@anthropic.com>
</commit_message>
<xml_diff>
--- a/paper/paper.docx
+++ b/paper/paper.docx
@@ -212,7 +212,7 @@
         <w:jc w:val="both"/>
       </w:pPr>
       <w:r>
-        <w:t xml:space="preserve">Later work broadened diversification. Vieira et al. proposed a framework to evaluate and optimize query result diversification, with two greedy methods, GMC and GNE, that gave more diverse results faster than earlier methods [2]. Drosou and Pitoura grouped diversity definitions into content, novelty and coverage based families [3], and later kept a diverse set updated over streaming data with a cover tree [4]. Zheng et al. reviewed diversification across databases, search, recommender systems and graphs, and named efficient query-time diversification as an open problem [5]. In each of these the diversification step always runs, with no check of whether the result is already diverse.</w:t>
+        <w:t xml:space="preserve">Later work broadened diversification. Vieira et al. proposed a framework to evaluate and optimize query result diversification, with two greedy methods, GMC and GNE, that gave more diverse results faster than earlier methods [2]. Drosou and Pitoura grouped diversity definitions into content, novelty and coverage based families [3], and later kept a diverse set updated over streaming data with a cover tree [4]. Zheng et al. reviewed diversification across databases, search, recommender systems and graphs, and named efficient query-time diversification as an open problem [5]. To our knowledge, none of these methods first checks whether the result is already diverse before running the diversification step.</w:t>
       </w:r>
     </w:p>
     <w:p>
@@ -222,6 +222,15 @@
       </w:pPr>
       <w:r>
         <w:t xml:space="preserve">Studies of RAG show why redundant context matters. Surveys identify redundant and irrelevant retrieved content as a cause of poor output quality [6] and as a persistent limitation of current systems [9]. Huang et al. note that repetitive or irrelevant retrieved context can lead a RAG model to hallucinate [10]. Cuconasu et al. studied how the type of retrieved passage affects RAG accuracy [7], and Salemi and Zamani argued that a RAG retriever should be judged by how much it helps the generator, beyond relevance alone [8]. Agarwal et al. found that the same chunks are often retrieved across different queries and reused their computation through caching [11]. Together these works treat redundant retrieved content as an open problem for RAG, and the gate in this paper addresses the cost of correcting it.</w:t>
+      </w:r>
+    </w:p>
+    <w:p>
+      <w:pPr>
+        <w:spacing w:after="120" w:line="264"/>
+        <w:jc w:val="both"/>
+      </w:pPr>
+      <w:r>
+        <w:t xml:space="preserve">Adaptive retrieval methods are the closest prior work to a conditional step in RAG. Self-RAG trains the model to decide when to retrieve and to critique its own output [12], and Adaptive-RAG routes each query to a retrieval strategy based on its predicted complexity [13]. Both decide from the query or the model, whereas the gate decides from the retrieved set itself and needs no training.</w:t>
       </w:r>
     </w:p>
     <w:p>
@@ -401,7 +410,7 @@
         <w:jc w:val="both"/>
       </w:pPr>
       <w:r>
-        <w:t xml:space="preserve">Dedup finds the most similar pair in the current set with S(i, j) &gt; δ, drops the member with lower relevance, and then rechecks the smaller set, repeating until no pair exceeds δ. Removing one chunk at a time avoids over-pruning when three or more chunks are similar, since in a set where A-B and B-C exceed δ while A-C does not, dropping B alone resolves both pairs and keeps A and C, whereas a single pass would drop both B and C.</w:t>
+        <w:t xml:space="preserve">Dedup finds the most similar pair in the current set with S(i, j) &gt; δ, drops the member with lower relevance, and then rechecks the smaller set, repeating until no pair exceeds δ. Removing one chunk at a time avoids over-pruning when three or more chunks are similar. In a set where A-B and B-C exceed δ while A-C does not, dropping B alone resolves both pairs and keeps A and C, whereas a single pass would drop both B and C.</w:t>
       </w:r>
     </w:p>
     <w:p>
@@ -576,7 +585,7 @@
         <w:jc w:val="both"/>
       </w:pPr>
       <w:r>
-        <w:t xml:space="preserve">Chunks and queries are embedded with BAAI/bge-base-en-v1.5 through the sentence-transformers library, with the BGE retrieval instruction prefix added to queries only. Retrieval is exact cosine search in NumPy, which is enough for 136 chunks. All experiments ran on a laptop with an Intel Core i5-10300H processor (4 cores, 8 threads, up to 4.5 GHz) and 16 GB of RAM, using the CPU build of PyTorch so that similarities are identical across machines.</w:t>
+        <w:t xml:space="preserve">Chunks and queries are embedded with BAAI/bge-base-en-v1.5 [14] through the sentence-transformers library [15], with the BGE retrieval instruction prefix added to queries only. Retrieval is exact cosine search in NumPy, which is enough for 136 chunks. All experiments ran on a laptop with an Intel Core i5-10300H processor (4 cores, 8 threads, up to 4.5 GHz) and 16 GB of RAM, using the CPU build of PyTorch to keep similarities consistent across runs.</w:t>
       </w:r>
     </w:p>
     <w:p>
@@ -696,7 +705,7 @@
         <w:jc w:val="both"/>
       </w:pPr>
       <w:r>
-        <w:t xml:space="preserve">Intra-list similarity (ILS) is the mean pairwise similarity of the final set, where lower ILS means less redundancy, and relevance is the mean query-to-chunk similarity of the final set. Because ILS alone can be lowered by returning unrelated chunks, the two are always read together. Every metric is reported for all queries and separately for tripped and untripped ones.</w:t>
+        <w:t xml:space="preserve">Intra-list similarity (ILS) [16] is the mean pairwise similarity of the final set, where lower ILS means less redundancy, and relevance is the mean query-to-chunk similarity of the final set. Because ILS alone can be lowered by returning unrelated chunks, the two are always read together. Every metric is reported for all queries and separately for tripped and untripped ones.</w:t>
       </w:r>
     </w:p>
     <w:p>
@@ -3738,7 +3747,7 @@
         <w:jc w:val="both"/>
       </w:pPr>
       <w:r>
-        <w:t xml:space="preserve">A single similarity score cannot fully separate a continuation from a copy. Adjacent chunks in one article share no sentences, yet 7 of the 133 adjacent pairs score above δ, reaching 0.896, which indicates that BGE rates the next paragraph on the same subject about as high as a 75% copy, a blind spot MMR shares because it depends on the same scores.</w:t>
+        <w:t xml:space="preserve">A single similarity score cannot fully separate a continuation from a copy. Adjacent chunks in one article share no sentences, yet 7 of the 133 adjacent pairs score above δ, reaching 0.896. This indicates that BGE rates the next paragraph on the same subject about as high as a 75% copy, a blind spot MMR shares because it depends on the same scores.</w:t>
       </w:r>
     </w:p>
     <w:p>
@@ -4106,6 +4115,135 @@
           <w:szCs w:val="20"/>
         </w:rPr>
         <w:t xml:space="preserve">. ACM, 2025.</w:t>
+      </w:r>
+    </w:p>
+    <w:p>
+      <w:pPr>
+        <w:spacing w:after="80"/>
+        <w:ind w:left="400" w:hanging="400"/>
+      </w:pPr>
+      <w:r>
+        <w:rPr>
+          <w:sz w:val="20"/>
+          <w:szCs w:val="20"/>
+        </w:rPr>
+        <w:t xml:space="preserve">[12] A. Asai, Z. Wu, Y. Wang, A. Sil and H. Hajishirzi. Self-RAG: Learning to Retrieve, Generate, and Critique through Self-Reflection. In </w:t>
+      </w:r>
+      <w:r>
+        <w:rPr>
+          <w:i/>
+          <w:iCs/>
+          <w:sz w:val="20"/>
+          <w:szCs w:val="20"/>
+        </w:rPr>
+        <w:t xml:space="preserve">International Conference on Learning Representations (ICLR)</w:t>
+      </w:r>
+      <w:r>
+        <w:rPr>
+          <w:sz w:val="20"/>
+          <w:szCs w:val="20"/>
+        </w:rPr>
+        <w:t xml:space="preserve">, 2024.</w:t>
+      </w:r>
+    </w:p>
+    <w:p>
+      <w:pPr>
+        <w:spacing w:after="80"/>
+        <w:ind w:left="400" w:hanging="400"/>
+      </w:pPr>
+      <w:r>
+        <w:rPr>
+          <w:sz w:val="20"/>
+          <w:szCs w:val="20"/>
+        </w:rPr>
+        <w:t xml:space="preserve">[13] S. Jeong, J. Baek, S. Cho, S. J. Hwang and J. C. Park. Adaptive-RAG: Learning to Adapt Retrieval-Augmented Large Language Models through Question Complexity. In </w:t>
+      </w:r>
+      <w:r>
+        <w:rPr>
+          <w:i/>
+          <w:iCs/>
+          <w:sz w:val="20"/>
+          <w:szCs w:val="20"/>
+        </w:rPr>
+        <w:t xml:space="preserve">Proceedings of NAACL-HLT</w:t>
+      </w:r>
+      <w:r>
+        <w:rPr>
+          <w:sz w:val="20"/>
+          <w:szCs w:val="20"/>
+        </w:rPr>
+        <w:t xml:space="preserve">, 2024.</w:t>
+      </w:r>
+    </w:p>
+    <w:p>
+      <w:pPr>
+        <w:spacing w:after="80"/>
+        <w:ind w:left="400" w:hanging="400"/>
+      </w:pPr>
+      <w:r>
+        <w:rPr>
+          <w:sz w:val="20"/>
+          <w:szCs w:val="20"/>
+        </w:rPr>
+        <w:t xml:space="preserve">[14] S. Xiao, Z. Liu, P. Zhang and N. Muennighoff. C-Pack: Packaged Resources To Advance General Chinese Embedding. arXiv preprint arXiv:2309.07597, 2023.</w:t>
+      </w:r>
+    </w:p>
+    <w:p>
+      <w:pPr>
+        <w:spacing w:after="80"/>
+        <w:ind w:left="400" w:hanging="400"/>
+      </w:pPr>
+      <w:r>
+        <w:rPr>
+          <w:sz w:val="20"/>
+          <w:szCs w:val="20"/>
+        </w:rPr>
+        <w:t xml:space="preserve">[15] N. Reimers and I. Gurevych. Sentence-BERT: Sentence Embeddings using Siamese BERT-Networks. In </w:t>
+      </w:r>
+      <w:r>
+        <w:rPr>
+          <w:i/>
+          <w:iCs/>
+          <w:sz w:val="20"/>
+          <w:szCs w:val="20"/>
+        </w:rPr>
+        <w:t xml:space="preserve">Proceedings of EMNLP-IJCNLP</w:t>
+      </w:r>
+      <w:r>
+        <w:rPr>
+          <w:sz w:val="20"/>
+          <w:szCs w:val="20"/>
+        </w:rPr>
+        <w:t xml:space="preserve">, 2019.</w:t>
+      </w:r>
+    </w:p>
+    <w:p>
+      <w:pPr>
+        <w:spacing w:after="80"/>
+        <w:ind w:left="400" w:hanging="400"/>
+      </w:pPr>
+      <w:r>
+        <w:rPr>
+          <w:sz w:val="20"/>
+          <w:szCs w:val="20"/>
+        </w:rPr>
+        <w:t xml:space="preserve">[16] C.-N. Ziegler, S. M. McNee, J. A. Konstan and G. Lausen. Improving Recommendation Lists Through Topic Diversification. In </w:t>
+      </w:r>
+      <w:r>
+        <w:rPr>
+          <w:i/>
+          <w:iCs/>
+          <w:sz w:val="20"/>
+          <w:szCs w:val="20"/>
+        </w:rPr>
+        <w:t xml:space="preserve">Proceedings of the 14th International Conference on World Wide Web (WWW '05)</w:t>
+      </w:r>
+      <w:r>
+        <w:rPr>
+          <w:sz w:val="20"/>
+          <w:szCs w:val="20"/>
+        </w:rPr>
+        <w:t xml:space="preserve">, pages 22-32, 2005.</w:t>
       </w:r>
     </w:p>
     <w:sectPr>

</xml_diff>